<commit_message>
docs(sql): tach bang phan cong thanh cac dau viec chi tiet
</commit_message>
<xml_diff>
--- a/SQL/thuc_hanh_nhom/BangPhanCong_SQL_Nhom08.docx
+++ b/SQL/thuc_hanh_nhom/BangPhanCong_SQL_Nhom08.docx
@@ -315,6 +315,7 @@
         <w:trPr>
           <w:trHeight w:val="520"/>
           <w:jc w:val="center"/>
+          <w:tblHeader/>
         </w:trPr>
         <w:tc>
           <w:tcPr>
@@ -688,6 +689,7 @@
         <w:trPr>
           <w:trHeight w:val="804"/>
           <w:jc w:val="center"/>
+          <w:cantSplit/>
         </w:trPr>
         <w:tc>
           <w:tcPr>
@@ -815,8 +817,129 @@
             <w:r>
               <w:rPr>
                 <w:rFonts w:ascii="Times New Roman" w:hAnsi="Times New Roman" w:cs="Times New Roman"/>
-              </w:rPr>
-              <w:t>Module 00, 01, 08. Thiết kế bảng và quan hệ; PK, FK, UNIQUE, CHECK, DEFAULT, kiểu dữ liệu và dữ liệu gốc. Thực hành CRUD danh mục bằng SP, phát hiện dữ liệu sai; giải thích chuẩn hóa và ngừng sử dụng thay xóa lịch sử. Tạo/gỡ index trên bảng tạm, đối chiếu kế hoạch và logical reads trước/sau. Minh chứng: V01–V06.</w:t>
+                <w:b/>
+              </w:rPr>
+              <w:t>Module 00, 01, 08.</w:t>
+            </w:r>
+          </w:p>
+          <w:p>
+            <w:pPr>
+              <w:spacing w:after="0" w:line="252" w:lineRule="auto"/>
+              <w:rPr>
+                <w:rFonts w:ascii="Times New Roman" w:hAnsi="Times New Roman" w:cs="Times New Roman"/>
+              </w:rPr>
+              <w:ind w:left="140" w:hanging="140"/>
+            </w:pPr>
+            <w:r>
+              <w:rPr>
+                <w:rFonts w:ascii="Times New Roman" w:hAnsi="Times New Roman" w:cs="Times New Roman"/>
+              </w:rPr>
+              <w:t>- Thiết kế 28 bảng; xác định PK, FK và quan hệ giữa các bảng (V01).</w:t>
+            </w:r>
+          </w:p>
+          <w:p>
+            <w:pPr>
+              <w:spacing w:after="0" w:line="252" w:lineRule="auto"/>
+              <w:rPr>
+                <w:rFonts w:ascii="Times New Roman" w:hAnsi="Times New Roman" w:cs="Times New Roman"/>
+              </w:rPr>
+              <w:ind w:left="140" w:hanging="140"/>
+            </w:pPr>
+            <w:r>
+              <w:rPr>
+                <w:rFonts w:ascii="Times New Roman" w:hAnsi="Times New Roman" w:cs="Times New Roman"/>
+              </w:rPr>
+              <w:t>- Giải thích kiểu dữ liệu, NOT NULL, DEFAULT, cột tính toán và chuẩn hóa (V01).</w:t>
+            </w:r>
+          </w:p>
+          <w:p>
+            <w:pPr>
+              <w:spacing w:after="0" w:line="252" w:lineRule="auto"/>
+              <w:rPr>
+                <w:rFonts w:ascii="Times New Roman" w:hAnsi="Times New Roman" w:cs="Times New Roman"/>
+              </w:rPr>
+              <w:ind w:left="140" w:hanging="140"/>
+            </w:pPr>
+            <w:r>
+              <w:rPr>
+                <w:rFonts w:ascii="Times New Roman" w:hAnsi="Times New Roman" w:cs="Times New Roman"/>
+              </w:rPr>
+              <w:t>- Kiểm tra CHECK giá âm, FK sai và UNIQUE trùng số điện thoại (V04a–V04c).</w:t>
+            </w:r>
+          </w:p>
+          <w:p>
+            <w:pPr>
+              <w:spacing w:after="0" w:line="252" w:lineRule="auto"/>
+              <w:rPr>
+                <w:rFonts w:ascii="Times New Roman" w:hAnsi="Times New Roman" w:cs="Times New Roman"/>
+              </w:rPr>
+              <w:ind w:left="140" w:hanging="140"/>
+            </w:pPr>
+            <w:r>
+              <w:rPr>
+                <w:rFonts w:ascii="Times New Roman" w:hAnsi="Times New Roman" w:cs="Times New Roman"/>
+              </w:rPr>
+              <w:t>- Thêm, sửa, ngừng dùng danh mục qua SP; rollback dữ liệu thử (V03).</w:t>
+            </w:r>
+          </w:p>
+          <w:p>
+            <w:pPr>
+              <w:spacing w:after="0" w:line="252" w:lineRule="auto"/>
+              <w:rPr>
+                <w:rFonts w:ascii="Times New Roman" w:hAnsi="Times New Roman" w:cs="Times New Roman"/>
+              </w:rPr>
+              <w:ind w:left="140" w:hanging="140"/>
+            </w:pPr>
+            <w:r>
+              <w:rPr>
+                <w:rFonts w:ascii="Times New Roman" w:hAnsi="Times New Roman" w:cs="Times New Roman"/>
+              </w:rPr>
+              <w:t>- Phân biệt seed 7 vai trò với bộ dữ liệu minh họa có khách, thợ và đơn (V02).</w:t>
+            </w:r>
+          </w:p>
+          <w:p>
+            <w:pPr>
+              <w:spacing w:after="0" w:line="252" w:lineRule="auto"/>
+              <w:rPr>
+                <w:rFonts w:ascii="Times New Roman" w:hAnsi="Times New Roman" w:cs="Times New Roman"/>
+              </w:rPr>
+              <w:ind w:left="140" w:hanging="140"/>
+            </w:pPr>
+            <w:r>
+              <w:rPr>
+                <w:rFonts w:ascii="Times New Roman" w:hAnsi="Times New Roman" w:cs="Times New Roman"/>
+              </w:rPr>
+              <w:t>- Giải thích index thường, UNIQUE lọc và điều kiện phân công còn hiệu lực (V05).</w:t>
+            </w:r>
+          </w:p>
+          <w:p>
+            <w:pPr>
+              <w:spacing w:after="0" w:line="252" w:lineRule="auto"/>
+              <w:rPr>
+                <w:rFonts w:ascii="Times New Roman" w:hAnsi="Times New Roman" w:cs="Times New Roman"/>
+              </w:rPr>
+              <w:ind w:left="140" w:hanging="140"/>
+            </w:pPr>
+            <w:r>
+              <w:rPr>
+                <w:rFonts w:ascii="Times New Roman" w:hAnsi="Times New Roman" w:cs="Times New Roman"/>
+              </w:rPr>
+              <w:t>- Tạo/gỡ index trên bảng tạm; so sánh Scan/Seek và logical reads trước/sau (V06).</w:t>
+            </w:r>
+          </w:p>
+          <w:p>
+            <w:pPr>
+              <w:spacing w:after="0" w:line="252" w:lineRule="auto"/>
+              <w:rPr>
+                <w:rFonts w:ascii="Times New Roman" w:hAnsi="Times New Roman" w:cs="Times New Roman"/>
+              </w:rPr>
+              <w:ind w:left="140" w:hanging="140"/>
+            </w:pPr>
+            <w:r>
+              <w:rPr>
+                <w:rFonts w:ascii="Times New Roman" w:hAnsi="Times New Roman" w:cs="Times New Roman"/>
+              </w:rPr>
+              <w:t>- Trình bày lợi ích, chi phí ghi và lý do chọn cột khóa/INCLUDE của index (V06).</w:t>
             </w:r>
           </w:p>
         </w:tc>
@@ -924,6 +1047,7 @@
         <w:trPr>
           <w:trHeight w:val="804"/>
           <w:jc w:val="center"/>
+          <w:cantSplit/>
         </w:trPr>
         <w:tc>
           <w:tcPr>
@@ -1051,8 +1175,129 @@
             <w:r>
               <w:rPr>
                 <w:rFonts w:ascii="Times New Roman" w:hAnsi="Times New Roman" w:cs="Times New Roman"/>
-              </w:rPr>
-              <w:t>Module 02, 03; báo cáo đọc trong 05. Phụ trách view danh sách, tổng hợp đơn, doanh thu, ví và hiệu suất; JOIN, GROUP BY, HAVING; đủ 6 hàm scalar/TVF tính tiền, hoa hồng, số dư, đánh giá, thống kê, bảo hành. Đối chiếu giá vật tư/nghiệm thu; tự viết và gọi view/hàm ngắn; giải thích nhiều tập kết quả báo cáo. Minh chứng: T01–T06.</w:t>
+                <w:b/>
+              </w:rPr>
+              <w:t>Module 02, 03; báo cáo đọc trong 05.</w:t>
+            </w:r>
+          </w:p>
+          <w:p>
+            <w:pPr>
+              <w:spacing w:after="0" w:line="252" w:lineRule="auto"/>
+              <w:rPr>
+                <w:rFonts w:ascii="Times New Roman" w:hAnsi="Times New Roman" w:cs="Times New Roman"/>
+              </w:rPr>
+              <w:ind w:left="140" w:hanging="140"/>
+            </w:pPr>
+            <w:r>
+              <w:rPr>
+                <w:rFonts w:ascii="Times New Roman" w:hAnsi="Times New Roman" w:cs="Times New Roman"/>
+              </w:rPr>
+              <w:t>- Giải thích view đơn hàng, dịch vụ và danh mục; dùng INNER JOIN/LEFT JOIN (T01).</w:t>
+            </w:r>
+          </w:p>
+          <w:p>
+            <w:pPr>
+              <w:spacing w:after="0" w:line="252" w:lineRule="auto"/>
+              <w:rPr>
+                <w:rFonts w:ascii="Times New Roman" w:hAnsi="Times New Roman" w:cs="Times New Roman"/>
+              </w:rPr>
+              <w:ind w:left="140" w:hanging="140"/>
+            </w:pPr>
+            <w:r>
+              <w:rPr>
+                <w:rFonts w:ascii="Times New Roman" w:hAnsi="Times New Roman" w:cs="Times New Roman"/>
+              </w:rPr>
+              <w:t>- Viết truy vấn GROUP BY, HAVING, COUNT, SUM để thống kê đúng số đơn (T02).</w:t>
+            </w:r>
+          </w:p>
+          <w:p>
+            <w:pPr>
+              <w:spacing w:after="0" w:line="252" w:lineRule="auto"/>
+              <w:rPr>
+                <w:rFonts w:ascii="Times New Roman" w:hAnsi="Times New Roman" w:cs="Times New Roman"/>
+              </w:rPr>
+              <w:ind w:left="140" w:hanging="140"/>
+            </w:pPr>
+            <w:r>
+              <w:rPr>
+                <w:rFonts w:ascii="Times New Roman" w:hAnsi="Times New Roman" w:cs="Times New Roman"/>
+              </w:rPr>
+              <w:t>- Giải thích tổng thu, COD/BANK và hoa hồng đã đối soát trong view doanh thu (T02).</w:t>
+            </w:r>
+          </w:p>
+          <w:p>
+            <w:pPr>
+              <w:spacing w:after="0" w:line="252" w:lineRule="auto"/>
+              <w:rPr>
+                <w:rFonts w:ascii="Times New Roman" w:hAnsi="Times New Roman" w:cs="Times New Roman"/>
+              </w:rPr>
+              <w:ind w:left="140" w:hanging="140"/>
+            </w:pPr>
+            <w:r>
+              <w:rPr>
+                <w:rFonts w:ascii="Times New Roman" w:hAnsi="Times New Roman" w:cs="Times New Roman"/>
+              </w:rPr>
+              <w:t>- Trình bày hai hàm scalar: hoa hồng và tổng tiền đơn hàng (T03).</w:t>
+            </w:r>
+          </w:p>
+          <w:p>
+            <w:pPr>
+              <w:spacing w:after="0" w:line="252" w:lineRule="auto"/>
+              <w:rPr>
+                <w:rFonts w:ascii="Times New Roman" w:hAnsi="Times New Roman" w:cs="Times New Roman"/>
+              </w:rPr>
+              <w:ind w:left="140" w:hanging="140"/>
+            </w:pPr>
+            <w:r>
+              <w:rPr>
+                <w:rFonts w:ascii="Times New Roman" w:hAnsi="Times New Roman" w:cs="Times New Roman"/>
+              </w:rPr>
+              <w:t>- Trình bày bốn TVF: số dư ví, điểm đánh giá, thống kê đơn và hạn bảo hành (T03).</w:t>
+            </w:r>
+          </w:p>
+          <w:p>
+            <w:pPr>
+              <w:spacing w:after="0" w:line="252" w:lineRule="auto"/>
+              <w:rPr>
+                <w:rFonts w:ascii="Times New Roman" w:hAnsi="Times New Roman" w:cs="Times New Roman"/>
+              </w:rPr>
+              <w:ind w:left="140" w:hanging="140"/>
+            </w:pPr>
+            <w:r>
+              <w:rPr>
+                <w:rFonts w:ascii="Times New Roman" w:hAnsi="Times New Roman" w:cs="Times New Roman"/>
+              </w:rPr>
+              <w:t>- Đối chiếu đơn giá vật tư, thành tiền, tổng nghiệm thu và chênh lệch ví (T04).</w:t>
+            </w:r>
+          </w:p>
+          <w:p>
+            <w:pPr>
+              <w:spacing w:after="0" w:line="252" w:lineRule="auto"/>
+              <w:rPr>
+                <w:rFonts w:ascii="Times New Roman" w:hAnsi="Times New Roman" w:cs="Times New Roman"/>
+              </w:rPr>
+              <w:ind w:left="140" w:hanging="140"/>
+            </w:pPr>
+            <w:r>
+              <w:rPr>
+                <w:rFonts w:ascii="Times New Roman" w:hAnsi="Times New Roman" w:cs="Times New Roman"/>
+              </w:rPr>
+              <w:t>- Gọi SP báo cáo; đọc nhiều tập kết quả và view hiệu suất KTV (T05).</w:t>
+            </w:r>
+          </w:p>
+          <w:p>
+            <w:pPr>
+              <w:spacing w:after="0" w:line="252" w:lineRule="auto"/>
+              <w:rPr>
+                <w:rFonts w:ascii="Times New Roman" w:hAnsi="Times New Roman" w:cs="Times New Roman"/>
+              </w:rPr>
+              <w:ind w:left="140" w:hanging="140"/>
+            </w:pPr>
+            <w:r>
+              <w:rPr>
+                <w:rFonts w:ascii="Times New Roman" w:hAnsi="Times New Roman" w:cs="Times New Roman"/>
+              </w:rPr>
+              <w:t>- Tự viết view/hàm ngắn, gọi thử và rollback đối tượng thực hành (T06).</w:t>
             </w:r>
           </w:p>
         </w:tc>
@@ -1160,6 +1405,7 @@
         <w:trPr>
           <w:trHeight w:val="804"/>
           <w:jc w:val="center"/>
+          <w:cantSplit/>
         </w:trPr>
         <w:tc>
           <w:tcPr>
@@ -1287,8 +1533,159 @@
             <w:r>
               <w:rPr>
                 <w:rFonts w:ascii="Times New Roman" w:hAnsi="Times New Roman" w:cs="Times New Roman"/>
-              </w:rPr>
-              <w:t>Module 04, 05; trigger trạng thái trong 06. SP tài khoản/danh mục và nghiệp vụ đơn: tạo đơn, báo giá, điều phối, tiến độ, vật tư/nghiệm thu, hỗ trợ, phí hủy. Kiểm tra tham số, vai trò, TRY/CATCH/THROW; BEGIN/COMMIT/ROLLBACK, SAVEPOINT, XACT_STATE, khóa và ROWVERSION. Thử sai vai trò, phiên bản cũ và trigger nhiều dòng. Minh chứng: D01–D08.</w:t>
+                <w:b/>
+              </w:rPr>
+              <w:t>Module 04, 05; trigger trạng thái trong 06.</w:t>
+            </w:r>
+          </w:p>
+          <w:p>
+            <w:pPr>
+              <w:spacing w:after="0" w:line="252" w:lineRule="auto"/>
+              <w:rPr>
+                <w:rFonts w:ascii="Times New Roman" w:hAnsi="Times New Roman" w:cs="Times New Roman"/>
+              </w:rPr>
+              <w:ind w:left="140" w:hanging="140"/>
+            </w:pPr>
+            <w:r>
+              <w:rPr>
+                <w:rFonts w:ascii="Times New Roman" w:hAnsi="Times New Roman" w:cs="Times New Roman"/>
+              </w:rPr>
+              <w:t>- Rà soát SP tài khoản, danh mục, cấu hình; giải thích tham số và kiểm tra vai trò (D01).</w:t>
+            </w:r>
+          </w:p>
+          <w:p>
+            <w:pPr>
+              <w:spacing w:after="0" w:line="252" w:lineRule="auto"/>
+              <w:rPr>
+                <w:rFonts w:ascii="Times New Roman" w:hAnsi="Times New Roman" w:cs="Times New Roman"/>
+              </w:rPr>
+              <w:ind w:left="140" w:hanging="140"/>
+            </w:pPr>
+            <w:r>
+              <w:rPr>
+                <w:rFonts w:ascii="Times New Roman" w:hAnsi="Times New Roman" w:cs="Times New Roman"/>
+              </w:rPr>
+              <w:t>- Demo tạo đơn, báo giá sơ bộ và khách duyệt; đối chiếu lịch sử đơn (D02).</w:t>
+            </w:r>
+          </w:p>
+          <w:p>
+            <w:pPr>
+              <w:spacing w:after="0" w:line="252" w:lineRule="auto"/>
+              <w:rPr>
+                <w:rFonts w:ascii="Times New Roman" w:hAnsi="Times New Roman" w:cs="Times New Roman"/>
+              </w:rPr>
+              <w:ind w:left="140" w:hanging="140"/>
+            </w:pPr>
+            <w:r>
+              <w:rPr>
+                <w:rFonts w:ascii="Times New Roman" w:hAnsi="Times New Roman" w:cs="Times New Roman"/>
+              </w:rPr>
+              <w:t>- Đọc SP phân công, phản hồi KTV và chuyển trạng thái; giải thích thứ tự nghiệp vụ.</w:t>
+            </w:r>
+          </w:p>
+          <w:p>
+            <w:pPr>
+              <w:spacing w:after="0" w:line="252" w:lineRule="auto"/>
+              <w:rPr>
+                <w:rFonts w:ascii="Times New Roman" w:hAnsi="Times New Roman" w:cs="Times New Roman"/>
+              </w:rPr>
+              <w:ind w:left="140" w:hanging="140"/>
+            </w:pPr>
+            <w:r>
+              <w:rPr>
+                <w:rFonts w:ascii="Times New Roman" w:hAnsi="Times New Roman" w:cs="Times New Roman"/>
+              </w:rPr>
+              <w:t>- Demo BEGIN/COMMIT/ROLLBACK, SAVEPOINT và XACT_STATE (D02–D03).</w:t>
+            </w:r>
+          </w:p>
+          <w:p>
+            <w:pPr>
+              <w:spacing w:after="0" w:line="252" w:lineRule="auto"/>
+              <w:rPr>
+                <w:rFonts w:ascii="Times New Roman" w:hAnsi="Times New Roman" w:cs="Times New Roman"/>
+              </w:rPr>
+              <w:ind w:left="140" w:hanging="140"/>
+            </w:pPr>
+            <w:r>
+              <w:rPr>
+                <w:rFonts w:ascii="Times New Roman" w:hAnsi="Times New Roman" w:cs="Times New Roman"/>
+              </w:rPr>
+              <w:t>- Giải thích TRY/CATCH/THROW; xử lý sai đầu vào và rollback khi lỗi (D01–D04).</w:t>
+            </w:r>
+          </w:p>
+          <w:p>
+            <w:pPr>
+              <w:spacing w:after="0" w:line="252" w:lineRule="auto"/>
+              <w:rPr>
+                <w:rFonts w:ascii="Times New Roman" w:hAnsi="Times New Roman" w:cs="Times New Roman"/>
+              </w:rPr>
+              <w:ind w:left="140" w:hanging="140"/>
+            </w:pPr>
+            <w:r>
+              <w:rPr>
+                <w:rFonts w:ascii="Times New Roman" w:hAnsi="Times New Roman" w:cs="Times New Roman"/>
+              </w:rPr>
+              <w:t>- Thử ROWVERSION cũ; giải thích UPDLOCK/HOLDLOCK và cập nhật đồng thời (D04).</w:t>
+            </w:r>
+          </w:p>
+          <w:p>
+            <w:pPr>
+              <w:spacing w:after="0" w:line="252" w:lineRule="auto"/>
+              <w:rPr>
+                <w:rFonts w:ascii="Times New Roman" w:hAnsi="Times New Roman" w:cs="Times New Roman"/>
+              </w:rPr>
+              <w:ind w:left="140" w:hanging="140"/>
+            </w:pPr>
+            <w:r>
+              <w:rPr>
+                <w:rFonts w:ascii="Times New Roman" w:hAnsi="Times New Roman" w:cs="Times New Roman"/>
+              </w:rPr>
+              <w:t>- Demo trigger chặn nhảy trạng thái khi UPDATE nhiều dòng (D05).</w:t>
+            </w:r>
+          </w:p>
+          <w:p>
+            <w:pPr>
+              <w:spacing w:after="0" w:line="252" w:lineRule="auto"/>
+              <w:rPr>
+                <w:rFonts w:ascii="Times New Roman" w:hAnsi="Times New Roman" w:cs="Times New Roman"/>
+              </w:rPr>
+              <w:ind w:left="140" w:hanging="140"/>
+            </w:pPr>
+            <w:r>
+              <w:rPr>
+                <w:rFonts w:ascii="Times New Roman" w:hAnsi="Times New Roman" w:cs="Times New Roman"/>
+              </w:rPr>
+              <w:t>- Kê khai vật tư có đơn giá, lập nghiệm thu và kiểm tra tổng tiền tại SQL (D06).</w:t>
+            </w:r>
+          </w:p>
+          <w:p>
+            <w:pPr>
+              <w:spacing w:after="0" w:line="252" w:lineRule="auto"/>
+              <w:rPr>
+                <w:rFonts w:ascii="Times New Roman" w:hAnsi="Times New Roman" w:cs="Times New Roman"/>
+              </w:rPr>
+              <w:ind w:left="140" w:hanging="140"/>
+            </w:pPr>
+            <w:r>
+              <w:rPr>
+                <w:rFonts w:ascii="Times New Roman" w:hAnsi="Times New Roman" w:cs="Times New Roman"/>
+              </w:rPr>
+              <w:t>- Demo khách gửi hỗ trợ, CSKH tiếp nhận, phản hồi và giải quyết (D07).</w:t>
+            </w:r>
+          </w:p>
+          <w:p>
+            <w:pPr>
+              <w:spacing w:after="0" w:line="252" w:lineRule="auto"/>
+              <w:rPr>
+                <w:rFonts w:ascii="Times New Roman" w:hAnsi="Times New Roman" w:cs="Times New Roman"/>
+              </w:rPr>
+              <w:ind w:left="140" w:hanging="140"/>
+            </w:pPr>
+            <w:r>
+              <w:rPr>
+                <w:rFonts w:ascii="Times New Roman" w:hAnsi="Times New Roman" w:cs="Times New Roman"/>
+              </w:rPr>
+              <w:t>- Demo hủy sau di chuyển có phí 60.000đ; phân biệt hủy miễn phí và yêu cầu CSKH (D08).</w:t>
             </w:r>
           </w:p>
         </w:tc>
@@ -1396,6 +1793,7 @@
         <w:trPr>
           <w:trHeight w:val="804"/>
           <w:jc w:val="center"/>
+          <w:cantSplit/>
         </w:trPr>
         <w:tc>
           <w:tcPr>
@@ -1523,8 +1921,159 @@
             <w:r>
               <w:rPr>
                 <w:rFonts w:ascii="Times New Roman" w:hAnsi="Times New Roman" w:cs="Times New Roman"/>
-              </w:rPr>
-              <w:t>Module 06, 07, 09, 10; đối soát trong 05. Trigger chứng từ, sổ cái, vật tư, chữ ký, đánh giá; 7 role nghiệp vụ và ngữ cảnh đăng nhập. Demo GRANT/REVOKE/DENY, EXECUTE AS/REVERT và thu hồi quyền chạy SP; đối soát COD/BANK, chặn duyệt lặp. Kiểm tra migration giữ dữ liệu; backup FULL/DIFF/LOG, VERIFYONLY, MOVE, phục hồi và CHECKDB. Minh chứng: A01–A08.</w:t>
+                <w:b/>
+              </w:rPr>
+              <w:t>Module 06, 07, 09, 10; đối soát trong 05.</w:t>
+            </w:r>
+          </w:p>
+          <w:p>
+            <w:pPr>
+              <w:spacing w:after="0" w:line="252" w:lineRule="auto"/>
+              <w:rPr>
+                <w:rFonts w:ascii="Times New Roman" w:hAnsi="Times New Roman" w:cs="Times New Roman"/>
+              </w:rPr>
+              <w:ind w:left="140" w:hanging="140"/>
+            </w:pPr>
+            <w:r>
+              <w:rPr>
+                <w:rFonts w:ascii="Times New Roman" w:hAnsi="Times New Roman" w:cs="Times New Roman"/>
+              </w:rPr>
+              <w:t>- Giải thích 7 trigger; phân biệt AFTER và INSTEAD OF, inserted/deleted (A01).</w:t>
+            </w:r>
+          </w:p>
+          <w:p>
+            <w:pPr>
+              <w:spacing w:after="0" w:line="252" w:lineRule="auto"/>
+              <w:rPr>
+                <w:rFonts w:ascii="Times New Roman" w:hAnsi="Times New Roman" w:cs="Times New Roman"/>
+              </w:rPr>
+              <w:ind w:left="140" w:hanging="140"/>
+            </w:pPr>
+            <w:r>
+              <w:rPr>
+                <w:rFonts w:ascii="Times New Roman" w:hAnsi="Times New Roman" w:cs="Times New Roman"/>
+              </w:rPr>
+              <w:t>- Demo sổ cái bất biến; giải thích bảo vệ vật tư, chữ ký và đánh giá (A02, module 06).</w:t>
+            </w:r>
+          </w:p>
+          <w:p>
+            <w:pPr>
+              <w:spacing w:after="0" w:line="252" w:lineRule="auto"/>
+              <w:rPr>
+                <w:rFonts w:ascii="Times New Roman" w:hAnsi="Times New Roman" w:cs="Times New Roman"/>
+              </w:rPr>
+              <w:ind w:left="140" w:hanging="140"/>
+            </w:pPr>
+            <w:r>
+              <w:rPr>
+                <w:rFonts w:ascii="Times New Roman" w:hAnsi="Times New Roman" w:cs="Times New Roman"/>
+              </w:rPr>
+              <w:t>- Trình bày 7 role nghiệp vụ, user hf_* và ngữ cảnh đăng nhập nội bộ (module 07).</w:t>
+            </w:r>
+          </w:p>
+          <w:p>
+            <w:pPr>
+              <w:spacing w:after="0" w:line="252" w:lineRule="auto"/>
+              <w:rPr>
+                <w:rFonts w:ascii="Times New Roman" w:hAnsi="Times New Roman" w:cs="Times New Roman"/>
+              </w:rPr>
+              <w:ind w:left="140" w:hanging="140"/>
+            </w:pPr>
+            <w:r>
+              <w:rPr>
+                <w:rFonts w:ascii="Times New Roman" w:hAnsi="Times New Roman" w:cs="Times New Roman"/>
+              </w:rPr>
+              <w:t>- Demo GRANT, REVOKE, DENY quyền SELECT; chạy truy vấn trước/sau để so sánh (A03).</w:t>
+            </w:r>
+          </w:p>
+          <w:p>
+            <w:pPr>
+              <w:spacing w:after="0" w:line="252" w:lineRule="auto"/>
+              <w:rPr>
+                <w:rFonts w:ascii="Times New Roman" w:hAnsi="Times New Roman" w:cs="Times New Roman"/>
+              </w:rPr>
+              <w:ind w:left="140" w:hanging="140"/>
+            </w:pPr>
+            <w:r>
+              <w:rPr>
+                <w:rFonts w:ascii="Times New Roman" w:hAnsi="Times New Roman" w:cs="Times New Roman"/>
+              </w:rPr>
+              <w:t>- Thu hồi quyền EXECUTE của SP; dùng EXECUTE AS/REVERT và khôi phục quyền (A04).</w:t>
+            </w:r>
+          </w:p>
+          <w:p>
+            <w:pPr>
+              <w:spacing w:after="0" w:line="252" w:lineRule="auto"/>
+              <w:rPr>
+                <w:rFonts w:ascii="Times New Roman" w:hAnsi="Times New Roman" w:cs="Times New Roman"/>
+              </w:rPr>
+              <w:ind w:left="140" w:hanging="140"/>
+            </w:pPr>
+            <w:r>
+              <w:rPr>
+                <w:rFonts w:ascii="Times New Roman" w:hAnsi="Times New Roman" w:cs="Times New Roman"/>
+              </w:rPr>
+              <w:t>- Giải thích đối soát COD/BANK, hoa hồng, biến động ví và chặn duyệt lặp (A05).</w:t>
+            </w:r>
+          </w:p>
+          <w:p>
+            <w:pPr>
+              <w:spacing w:after="0" w:line="252" w:lineRule="auto"/>
+              <w:rPr>
+                <w:rFonts w:ascii="Times New Roman" w:hAnsi="Times New Roman" w:cs="Times New Roman"/>
+              </w:rPr>
+              <w:ind w:left="140" w:hanging="140"/>
+            </w:pPr>
+            <w:r>
+              <w:rPr>
+                <w:rFonts w:ascii="Times New Roman" w:hAnsi="Times New Roman" w:cs="Times New Roman"/>
+              </w:rPr>
+              <w:t>- Kiểm tra migration giữ dữ liệu, tên bảng/cột mới và UNIQUE lọc nghiệm thu (A06).</w:t>
+            </w:r>
+          </w:p>
+          <w:p>
+            <w:pPr>
+              <w:spacing w:after="0" w:line="252" w:lineRule="auto"/>
+              <w:rPr>
+                <w:rFonts w:ascii="Times New Roman" w:hAnsi="Times New Roman" w:cs="Times New Roman"/>
+              </w:rPr>
+              <w:ind w:left="140" w:hanging="140"/>
+            </w:pPr>
+            <w:r>
+              <w:rPr>
+                <w:rFonts w:ascii="Times New Roman" w:hAnsi="Times New Roman" w:cs="Times New Roman"/>
+              </w:rPr>
+              <w:t>- Kiểm tra FK/CHECK, recovery model và ví khớp sổ cái trước sao lưu (A07).</w:t>
+            </w:r>
+          </w:p>
+          <w:p>
+            <w:pPr>
+              <w:spacing w:after="0" w:line="252" w:lineRule="auto"/>
+              <w:rPr>
+                <w:rFonts w:ascii="Times New Roman" w:hAnsi="Times New Roman" w:cs="Times New Roman"/>
+              </w:rPr>
+              <w:ind w:left="140" w:hanging="140"/>
+            </w:pPr>
+            <w:r>
+              <w:rPr>
+                <w:rFonts w:ascii="Times New Roman" w:hAnsi="Times New Roman" w:cs="Times New Roman"/>
+              </w:rPr>
+              <w:t>- Demo backup FULL, DIFF, LOG; giải thích COPY_ONLY và VERIFYONLY (A08).</w:t>
+            </w:r>
+          </w:p>
+          <w:p>
+            <w:pPr>
+              <w:spacing w:after="0" w:line="252" w:lineRule="auto"/>
+              <w:rPr>
+                <w:rFonts w:ascii="Times New Roman" w:hAnsi="Times New Roman" w:cs="Times New Roman"/>
+              </w:rPr>
+              <w:ind w:left="140" w:hanging="140"/>
+            </w:pPr>
+            <w:r>
+              <w:rPr>
+                <w:rFonts w:ascii="Times New Roman" w:hAnsi="Times New Roman" w:cs="Times New Roman"/>
+              </w:rPr>
+              <w:t>- Phục hồi sang tên mới bằng MOVE, NORECOVERY/RECOVERY; đọc dữ liệu và CHECKDB (A08).</w:t>
             </w:r>
           </w:p>
         </w:tc>

</xml_diff>

<commit_message>
Phân công đều 10 nhóm kiến thức SQL cho bốn thành viên
Viết lại bài thực hành theo từng phân hệ, mỗi người có đủ ràng buộc, index, view, function, SP, trigger, transaction, quyền, migration và sao lưu/phục hồi. Đồng bộ hướng dẫn, bảng Word/PDF theo rubric và kết quả kiểm chứng.
</commit_message>
<xml_diff>
--- a/SQL/thuc_hanh_nhom/BangPhanCong_SQL_Nhom08.docx
+++ b/SQL/thuc_hanh_nhom/BangPhanCong_SQL_Nhom08.docx
@@ -813,13 +813,13 @@
               <w:rPr>
                 <w:rFonts w:ascii="Times New Roman" w:hAnsi="Times New Roman" w:cs="Times New Roman"/>
               </w:rPr>
+              <w:ind w:left="140" w:hanging="140"/>
             </w:pPr>
             <w:r>
               <w:rPr>
                 <w:rFonts w:ascii="Times New Roman" w:hAnsi="Times New Roman" w:cs="Times New Roman"/>
-                <w:b/>
-              </w:rPr>
-              <w:t>Module 00, 01, 08.</w:t>
+              </w:rPr>
+              <w:t>Khách hàng, dịch vụ và đánh giá; đủ 10 nhóm kiến thức.</w:t>
             </w:r>
           </w:p>
           <w:p>
@@ -834,7 +834,7 @@
               <w:rPr>
                 <w:rFonts w:ascii="Times New Roman" w:hAnsi="Times New Roman" w:cs="Times New Roman"/>
               </w:rPr>
-              <w:t>- Thiết kế 28 bảng; xác định PK, FK và quan hệ giữa các bảng (V01).</w:t>
+              <w:t>- Thiết kế và ràng buộc DichVu; giải thích PK/FK, CHECK, UNIQUE, DEFAULT và dữ liệu gốc; thử đầu vào sai (V01).</w:t>
             </w:r>
           </w:p>
           <w:p>
@@ -849,7 +849,7 @@
               <w:rPr>
                 <w:rFonts w:ascii="Times New Roman" w:hAnsi="Times New Roman" w:cs="Times New Roman"/>
               </w:rPr>
-              <w:t>- Giải thích kiểu dữ liệu, NOT NULL, DEFAULT, cột tính toán và chuẩn hóa (V01).</w:t>
+              <w:t>- Tra cứu theo DanhMucId; tạo/gỡ index trên dữ liệu mô phỏng, so sánh IO và Scan/Seek (V02).</w:t>
             </w:r>
           </w:p>
           <w:p>
@@ -864,7 +864,7 @@
               <w:rPr>
                 <w:rFonts w:ascii="Times New Roman" w:hAnsi="Times New Roman" w:cs="Times New Roman"/>
               </w:rPr>
-              <w:t>- Kiểm tra CHECK giá âm, FK sai và UNIQUE trùng số điện thoại (V04a–V04c).</w:t>
+              <w:t>- Đọc, giải thích vw_DichVuCongKhai; tự tạo view ngắn cho phân hệ và kiểm tra kết quả (V03).</w:t>
             </w:r>
           </w:p>
           <w:p>
@@ -879,7 +879,7 @@
               <w:rPr>
                 <w:rFonts w:ascii="Times New Roman" w:hAnsi="Times New Roman" w:cs="Times New Roman"/>
               </w:rPr>
-              <w:t>- Thêm, sửa, ngừng dùng danh mục qua SP; rollback dữ liệu thử (V03).</w:t>
+              <w:t>- Sử dụng fn_DiemDanhGia; tự viết hàm tính toán và phân biệt scalar/TVF (V04).</w:t>
             </w:r>
           </w:p>
           <w:p>
@@ -894,7 +894,7 @@
               <w:rPr>
                 <w:rFonts w:ascii="Times New Roman" w:hAnsi="Times New Roman" w:cs="Times New Roman"/>
               </w:rPr>
-              <w:t>- Phân biệt seed 7 vai trò với bộ dữ liệu minh họa có khách, thợ và đơn (V02).</w:t>
+              <w:t>- Gọi sp_LuuDanhMucDichVu; giải thích tham số, quyền và nghiệp vụ; tự viết SP tra cứu theo mã (V05).</w:t>
             </w:r>
           </w:p>
           <w:p>
@@ -909,7 +909,7 @@
               <w:rPr>
                 <w:rFonts w:ascii="Times New Roman" w:hAnsi="Times New Roman" w:cs="Times New Roman"/>
               </w:rPr>
-              <w:t>- Giải thích index thường, UNIQUE lọc và điều kiện phân công còn hiệu lực (V05).</w:t>
+              <w:t>- Giải thích tr_DanhGia_KiemTraDon; chạy lệnh vi phạm để chứng minh trigger chặn (V06).</w:t>
             </w:r>
           </w:p>
           <w:p>
@@ -924,7 +924,7 @@
               <w:rPr>
                 <w:rFonts w:ascii="Times New Roman" w:hAnsi="Times New Roman" w:cs="Times New Roman"/>
               </w:rPr>
-              <w:t>- Tạo/gỡ index trên bảng tạm; so sánh Scan/Seek và logical reads trước/sau (V06).</w:t>
+              <w:t>- Thực hành BEGIN/COMMIT/ROLLBACK, SAVEPOINT, TRY/CATCH trên DichVu; giải thích khóa và phiên bản (V07).</w:t>
             </w:r>
           </w:p>
           <w:p>
@@ -939,7 +939,37 @@
               <w:rPr>
                 <w:rFonts w:ascii="Times New Roman" w:hAnsi="Times New Roman" w:cs="Times New Roman"/>
               </w:rPr>
-              <w:t>- Trình bày lợi ích, chi phí ghi và lý do chọn cột khóa/INCLUDE của index (V06).</w:t>
+              <w:t>- GRANT/REVOKE/GRANT/DENY SELECT trên vw_DichVuCongKhai cho role KH; EXECUTE AS, REVERT và khôi phục quyền (V08).</w:t>
+            </w:r>
+          </w:p>
+          <w:p>
+            <w:pPr>
+              <w:spacing w:after="0" w:line="252" w:lineRule="auto"/>
+              <w:rPr>
+                <w:rFonts w:ascii="Times New Roman" w:hAnsi="Times New Roman" w:cs="Times New Roman"/>
+              </w:rPr>
+              <w:ind w:left="140" w:hanging="140"/>
+            </w:pPr>
+            <w:r>
+              <w:rPr>
+                <w:rFonts w:ascii="Times New Roman" w:hAnsi="Times New Roman" w:cs="Times New Roman"/>
+              </w:rPr>
+              <w:t>- Đối chiếu module nâng cấp; tự mô phỏng ALTER có điều kiện cho dữ liệu khách hàng, dịch vụ và đánh giá, chạy lại không trùng cột (V09).</w:t>
+            </w:r>
+          </w:p>
+          <w:p>
+            <w:pPr>
+              <w:spacing w:after="0" w:line="252" w:lineRule="auto"/>
+              <w:rPr>
+                <w:rFonts w:ascii="Times New Roman" w:hAnsi="Times New Roman" w:cs="Times New Roman"/>
+              </w:rPr>
+              <w:ind w:left="140" w:hanging="140"/>
+            </w:pPr>
+            <w:r>
+              <w:rPr>
+                <w:rFonts w:ascii="Times New Roman" w:hAnsi="Times New Roman" w:cs="Times New Roman"/>
+              </w:rPr>
+              <w:t>- Tự sao lưu COPY_ONLY theo MSSV, VERIFYONLY; thực hiện FULL/DIFF/LOG, RESTORE MOVE và kiểm tra dữ liệu trên bản riêng (V10; file 05).</w:t>
             </w:r>
           </w:p>
         </w:tc>
@@ -1171,13 +1201,13 @@
               <w:rPr>
                 <w:rFonts w:ascii="Times New Roman" w:hAnsi="Times New Roman" w:cs="Times New Roman"/>
               </w:rPr>
+              <w:ind w:left="140" w:hanging="140"/>
             </w:pPr>
             <w:r>
               <w:rPr>
                 <w:rFonts w:ascii="Times New Roman" w:hAnsi="Times New Roman" w:cs="Times New Roman"/>
-                <w:b/>
-              </w:rPr>
-              <w:t>Module 02, 03; báo cáo đọc trong 05.</w:t>
+              </w:rPr>
+              <w:t>Đặt đơn, báo giá và điều phối; đủ 10 nhóm kiến thức.</w:t>
             </w:r>
           </w:p>
           <w:p>
@@ -1192,7 +1222,7 @@
               <w:rPr>
                 <w:rFonts w:ascii="Times New Roman" w:hAnsi="Times New Roman" w:cs="Times New Roman"/>
               </w:rPr>
-              <w:t>- Giải thích view đơn hàng, dịch vụ và danh mục; dùng INNER JOIN/LEFT JOIN (T01).</w:t>
+              <w:t>- Thiết kế và ràng buộc BaoGiaSoBo; giải thích PK/FK, CHECK, UNIQUE, DEFAULT và dữ liệu gốc; thử đầu vào sai (T01).</w:t>
             </w:r>
           </w:p>
           <w:p>
@@ -1207,7 +1237,7 @@
               <w:rPr>
                 <w:rFonts w:ascii="Times New Roman" w:hAnsi="Times New Roman" w:cs="Times New Roman"/>
               </w:rPr>
-              <w:t>- Viết truy vấn GROUP BY, HAVING, COUNT, SUM để thống kê đúng số đơn (T02).</w:t>
+              <w:t>- Tra cứu theo KhachHangId; tạo/gỡ index trên dữ liệu mô phỏng, so sánh IO và Scan/Seek (T02).</w:t>
             </w:r>
           </w:p>
           <w:p>
@@ -1222,7 +1252,7 @@
               <w:rPr>
                 <w:rFonts w:ascii="Times New Roman" w:hAnsi="Times New Roman" w:cs="Times New Roman"/>
               </w:rPr>
-              <w:t>- Giải thích tổng thu, COD/BANK và hoa hồng đã đối soát trong view doanh thu (T02).</w:t>
+              <w:t>- Đọc, giải thích vw_DonHangTongHop; tự tạo view ngắn cho phân hệ và kiểm tra kết quả (T03).</w:t>
             </w:r>
           </w:p>
           <w:p>
@@ -1237,7 +1267,7 @@
               <w:rPr>
                 <w:rFonts w:ascii="Times New Roman" w:hAnsi="Times New Roman" w:cs="Times New Roman"/>
               </w:rPr>
-              <w:t>- Trình bày hai hàm scalar: hoa hồng và tổng tiền đơn hàng (T03).</w:t>
+              <w:t>- Sử dụng fn_KyThuatVienPhuHop; tự viết hàm tính toán và phân biệt scalar/TVF (T04).</w:t>
             </w:r>
           </w:p>
           <w:p>
@@ -1252,7 +1282,7 @@
               <w:rPr>
                 <w:rFonts w:ascii="Times New Roman" w:hAnsi="Times New Roman" w:cs="Times New Roman"/>
               </w:rPr>
-              <w:t>- Trình bày năm TVF: số dư ví, điểm đánh giá, thống kê đơn, hạn bảo hành và lọc thợ phù hợp (T03).</w:t>
+              <w:t>- Gọi sp_TaoBaoGiaSoBo; giải thích tham số, quyền và nghiệp vụ; tự viết SP tra cứu theo mã (T05).</w:t>
             </w:r>
           </w:p>
           <w:p>
@@ -1267,7 +1297,7 @@
               <w:rPr>
                 <w:rFonts w:ascii="Times New Roman" w:hAnsi="Times New Roman" w:cs="Times New Roman"/>
               </w:rPr>
-              <w:t>- Đối chiếu đơn giá vật tư, thành tiền, tổng nghiệm thu và chênh lệch ví (T04).</w:t>
+              <w:t>- Giải thích tr_DonHang_KiemTraTrangThai; chạy lệnh vi phạm để chứng minh trigger chặn (T06).</w:t>
             </w:r>
           </w:p>
           <w:p>
@@ -1282,7 +1312,7 @@
               <w:rPr>
                 <w:rFonts w:ascii="Times New Roman" w:hAnsi="Times New Roman" w:cs="Times New Roman"/>
               </w:rPr>
-              <w:t>- Gọi SP báo cáo; đọc nhiều tập kết quả và view hiệu suất KTV (T05).</w:t>
+              <w:t>- Thực hành BEGIN/COMMIT/ROLLBACK, SAVEPOINT, TRY/CATCH trên BaoGiaSoBo; giải thích khóa và phiên bản (T07).</w:t>
             </w:r>
           </w:p>
           <w:p>
@@ -1297,7 +1327,37 @@
               <w:rPr>
                 <w:rFonts w:ascii="Times New Roman" w:hAnsi="Times New Roman" w:cs="Times New Roman"/>
               </w:rPr>
-              <w:t>- Tự viết view/hàm ngắn, gọi thử và rollback đối tượng thực hành (T06).</w:t>
+              <w:t>- GRANT/REVOKE/GRANT/DENY SELECT trên vw_DonHangTongHop cho role DPV; EXECUTE AS, REVERT và khôi phục quyền (T08).</w:t>
+            </w:r>
+          </w:p>
+          <w:p>
+            <w:pPr>
+              <w:spacing w:after="0" w:line="252" w:lineRule="auto"/>
+              <w:rPr>
+                <w:rFonts w:ascii="Times New Roman" w:hAnsi="Times New Roman" w:cs="Times New Roman"/>
+              </w:rPr>
+              <w:ind w:left="140" w:hanging="140"/>
+            </w:pPr>
+            <w:r>
+              <w:rPr>
+                <w:rFonts w:ascii="Times New Roman" w:hAnsi="Times New Roman" w:cs="Times New Roman"/>
+              </w:rPr>
+              <w:t>- Đối chiếu module nâng cấp; tự mô phỏng ALTER có điều kiện cho dữ liệu đặt đơn, báo giá và điều phối, chạy lại không trùng cột (T09).</w:t>
+            </w:r>
+          </w:p>
+          <w:p>
+            <w:pPr>
+              <w:spacing w:after="0" w:line="252" w:lineRule="auto"/>
+              <w:rPr>
+                <w:rFonts w:ascii="Times New Roman" w:hAnsi="Times New Roman" w:cs="Times New Roman"/>
+              </w:rPr>
+              <w:ind w:left="140" w:hanging="140"/>
+            </w:pPr>
+            <w:r>
+              <w:rPr>
+                <w:rFonts w:ascii="Times New Roman" w:hAnsi="Times New Roman" w:cs="Times New Roman"/>
+              </w:rPr>
+              <w:t>- Tự sao lưu COPY_ONLY theo MSSV, VERIFYONLY; thực hiện FULL/DIFF/LOG, RESTORE MOVE và kiểm tra dữ liệu trên bản riêng (T10; file 05).</w:t>
             </w:r>
           </w:p>
         </w:tc>
@@ -1529,13 +1589,13 @@
               <w:rPr>
                 <w:rFonts w:ascii="Times New Roman" w:hAnsi="Times New Roman" w:cs="Times New Roman"/>
               </w:rPr>
+              <w:ind w:left="140" w:hanging="140"/>
             </w:pPr>
             <w:r>
               <w:rPr>
                 <w:rFonts w:ascii="Times New Roman" w:hAnsi="Times New Roman" w:cs="Times New Roman"/>
-                <w:b/>
-              </w:rPr>
-              <w:t>Module 04, 05; trigger trạng thái trong 06.</w:t>
+              </w:rPr>
+              <w:t>Vật tư, nghiệm thu và bảo hành; đủ 10 nhóm kiến thức.</w:t>
             </w:r>
           </w:p>
           <w:p>
@@ -1550,7 +1610,7 @@
               <w:rPr>
                 <w:rFonts w:ascii="Times New Roman" w:hAnsi="Times New Roman" w:cs="Times New Roman"/>
               </w:rPr>
-              <w:t>- Rà soát SP tài khoản, danh mục, cấu hình; giải thích tham số và kiểm tra vai trò (D01).</w:t>
+              <w:t>- Thiết kế và ràng buộc ChiTietVatTu; giải thích PK/FK, CHECK, UNIQUE, DEFAULT và dữ liệu gốc; thử đầu vào sai (D01).</w:t>
             </w:r>
           </w:p>
           <w:p>
@@ -1565,7 +1625,7 @@
               <w:rPr>
                 <w:rFonts w:ascii="Times New Roman" w:hAnsi="Times New Roman" w:cs="Times New Roman"/>
               </w:rPr>
-              <w:t>- Demo tạo đơn, báo giá sơ bộ và khách duyệt; đối chiếu lịch sử đơn (D02).</w:t>
+              <w:t>- Tra cứu theo BangKeVatTuId; tạo/gỡ index trên dữ liệu mô phỏng, so sánh IO và Scan/Seek (D02).</w:t>
             </w:r>
           </w:p>
           <w:p>
@@ -1580,7 +1640,7 @@
               <w:rPr>
                 <w:rFonts w:ascii="Times New Roman" w:hAnsi="Times New Roman" w:cs="Times New Roman"/>
               </w:rPr>
-              <w:t>- Đọc SP phân công, phản hồi KTV và chuyển trạng thái; giải thích thứ tự nghiệp vụ.</w:t>
+              <w:t>- Đọc, giải thích vw_PhieuNghiemThu; tự tạo view ngắn cho phân hệ và kiểm tra kết quả (D03).</w:t>
             </w:r>
           </w:p>
           <w:p>
@@ -1595,7 +1655,7 @@
               <w:rPr>
                 <w:rFonts w:ascii="Times New Roman" w:hAnsi="Times New Roman" w:cs="Times New Roman"/>
               </w:rPr>
-              <w:t>- Demo BEGIN/COMMIT/ROLLBACK, SAVEPOINT và XACT_STATE (D02–D03).</w:t>
+              <w:t>- Sử dụng fn_HanBaoHanh; tự viết hàm tính toán và phân biệt scalar/TVF (D04).</w:t>
             </w:r>
           </w:p>
           <w:p>
@@ -1610,7 +1670,7 @@
               <w:rPr>
                 <w:rFonts w:ascii="Times New Roman" w:hAnsi="Times New Roman" w:cs="Times New Roman"/>
               </w:rPr>
-              <w:t>- Giải thích TRY/CATCH/THROW; xử lý sai đầu vào và rollback khi lỗi (D01–D04).</w:t>
+              <w:t>- Gọi sp_LuuBangKeVatTu; giải thích tham số, quyền và nghiệp vụ; tự viết SP tra cứu theo mã (D05).</w:t>
             </w:r>
           </w:p>
           <w:p>
@@ -1625,7 +1685,7 @@
               <w:rPr>
                 <w:rFonts w:ascii="Times New Roman" w:hAnsi="Times New Roman" w:cs="Times New Roman"/>
               </w:rPr>
-              <w:t>- Thử ROWVERSION cũ; giải thích UPDLOCK/HOLDLOCK và cập nhật đồng thời (D04).</w:t>
+              <w:t>- Giải thích tr_ChiTietVatTu_KhoaNghiemThu; chạy lệnh vi phạm để chứng minh trigger chặn (D06).</w:t>
             </w:r>
           </w:p>
           <w:p>
@@ -1640,7 +1700,7 @@
               <w:rPr>
                 <w:rFonts w:ascii="Times New Roman" w:hAnsi="Times New Roman" w:cs="Times New Roman"/>
               </w:rPr>
-              <w:t>- Demo trigger chặn nhảy trạng thái khi UPDATE nhiều dòng (D05).</w:t>
+              <w:t>- Thực hành BEGIN/COMMIT/ROLLBACK, SAVEPOINT, TRY/CATCH trên ChiTietVatTu; giải thích khóa và phiên bản (D07).</w:t>
             </w:r>
           </w:p>
           <w:p>
@@ -1655,7 +1715,7 @@
               <w:rPr>
                 <w:rFonts w:ascii="Times New Roman" w:hAnsi="Times New Roman" w:cs="Times New Roman"/>
               </w:rPr>
-              <w:t>- Kê khai vật tư có đơn giá, lập nghiệm thu và kiểm tra tổng tiền tại SQL (D06).</w:t>
+              <w:t>- GRANT/REVOKE/GRANT/DENY SELECT trên vw_PhieuNghiemThu cho role KTV; EXECUTE AS, REVERT và khôi phục quyền (D08).</w:t>
             </w:r>
           </w:p>
           <w:p>
@@ -1670,7 +1730,7 @@
               <w:rPr>
                 <w:rFonts w:ascii="Times New Roman" w:hAnsi="Times New Roman" w:cs="Times New Roman"/>
               </w:rPr>
-              <w:t>- Demo khách gửi hỗ trợ, CSKH tiếp nhận, phản hồi và giải quyết (D07).</w:t>
+              <w:t>- Đối chiếu module nâng cấp; tự mô phỏng ALTER có điều kiện cho dữ liệu vật tư, nghiệm thu và bảo hành, chạy lại không trùng cột (D09).</w:t>
             </w:r>
           </w:p>
           <w:p>
@@ -1685,7 +1745,7 @@
               <w:rPr>
                 <w:rFonts w:ascii="Times New Roman" w:hAnsi="Times New Roman" w:cs="Times New Roman"/>
               </w:rPr>
-              <w:t>- Demo hủy sau di chuyển có phí 60.000đ; phân biệt hủy miễn phí và yêu cầu CSKH (D08).</w:t>
+              <w:t>- Tự sao lưu COPY_ONLY theo MSSV, VERIFYONLY; thực hiện FULL/DIFF/LOG, RESTORE MOVE và kiểm tra dữ liệu trên bản riêng (D10; file 05).</w:t>
             </w:r>
           </w:p>
         </w:tc>
@@ -1917,13 +1977,13 @@
               <w:rPr>
                 <w:rFonts w:ascii="Times New Roman" w:hAnsi="Times New Roman" w:cs="Times New Roman"/>
               </w:rPr>
+              <w:ind w:left="140" w:hanging="140"/>
             </w:pPr>
             <w:r>
               <w:rPr>
                 <w:rFonts w:ascii="Times New Roman" w:hAnsi="Times New Roman" w:cs="Times New Roman"/>
-                <w:b/>
-              </w:rPr>
-              <w:t>Module 06, 07, 09, 10; đối soát trong 05.</w:t>
+              </w:rPr>
+              <w:t>Thanh toán, đối soát và ví kỹ thuật viên; đủ 10 nhóm kiến thức.</w:t>
             </w:r>
           </w:p>
           <w:p>
@@ -1938,7 +1998,7 @@
               <w:rPr>
                 <w:rFonts w:ascii="Times New Roman" w:hAnsi="Times New Roman" w:cs="Times New Roman"/>
               </w:rPr>
-              <w:t>- Giải thích 7 trigger; phân biệt AFTER và INSTEAD OF, inserted/deleted (A01).</w:t>
+              <w:t>- Thiết kế và ràng buộc KyThuatVien; giải thích PK/FK, CHECK, UNIQUE, DEFAULT và dữ liệu gốc; thử đầu vào sai (A01).</w:t>
             </w:r>
           </w:p>
           <w:p>
@@ -1953,7 +2013,7 @@
               <w:rPr>
                 <w:rFonts w:ascii="Times New Roman" w:hAnsi="Times New Roman" w:cs="Times New Roman"/>
               </w:rPr>
-              <w:t>- Demo sổ cái bất biến; giải thích bảo vệ vật tư, chữ ký và đánh giá (A02, module 06).</w:t>
+              <w:t>- Tra cứu theo KyThuatVienId; tạo/gỡ index trên dữ liệu mô phỏng, so sánh IO và Scan/Seek (A02).</w:t>
             </w:r>
           </w:p>
           <w:p>
@@ -1968,7 +2028,7 @@
               <w:rPr>
                 <w:rFonts w:ascii="Times New Roman" w:hAnsi="Times New Roman" w:cs="Times New Roman"/>
               </w:rPr>
-              <w:t>- Trình bày 7 role nghiệp vụ, user hf_* và ngữ cảnh đăng nhập nội bộ (module 07).</w:t>
+              <w:t>- Đọc, giải thích vw_ViKyThuatVien; tự tạo view ngắn cho phân hệ và kiểm tra kết quả (A03).</w:t>
             </w:r>
           </w:p>
           <w:p>
@@ -1983,7 +2043,7 @@
               <w:rPr>
                 <w:rFonts w:ascii="Times New Roman" w:hAnsi="Times New Roman" w:cs="Times New Roman"/>
               </w:rPr>
-              <w:t>- Demo GRANT, REVOKE, DENY quyền SELECT; chạy truy vấn trước/sau để so sánh (A03).</w:t>
+              <w:t>- Sử dụng fn_SoDuVi; tự viết hàm tính toán và phân biệt scalar/TVF (A04).</w:t>
             </w:r>
           </w:p>
           <w:p>
@@ -1998,7 +2058,7 @@
               <w:rPr>
                 <w:rFonts w:ascii="Times New Roman" w:hAnsi="Times New Roman" w:cs="Times New Roman"/>
               </w:rPr>
-              <w:t>- Thu hồi quyền EXECUTE của SP; dùng EXECUTE AS/REVERT và khôi phục quyền (A04).</w:t>
+              <w:t>- Gọi sp_LuuTaiKhoanNganHang; giải thích tham số, quyền và nghiệp vụ; tự viết SP tra cứu theo mã (A05).</w:t>
             </w:r>
           </w:p>
           <w:p>
@@ -2013,7 +2073,7 @@
               <w:rPr>
                 <w:rFonts w:ascii="Times New Roman" w:hAnsi="Times New Roman" w:cs="Times New Roman"/>
               </w:rPr>
-              <w:t>- Giải thích đối soát COD/BANK, hoa hồng, biến động ví và chặn duyệt lặp (A05).</w:t>
+              <w:t>- Giải thích tr_GiaoDichVi_BatBien; chạy lệnh vi phạm để chứng minh trigger chặn (A06).</w:t>
             </w:r>
           </w:p>
           <w:p>
@@ -2028,7 +2088,7 @@
               <w:rPr>
                 <w:rFonts w:ascii="Times New Roman" w:hAnsi="Times New Roman" w:cs="Times New Roman"/>
               </w:rPr>
-              <w:t>- Kiểm tra migration giữ dữ liệu, tên bảng/cột mới và UNIQUE lọc nghiệm thu (A06).</w:t>
+              <w:t>- Thực hành BEGIN/COMMIT/ROLLBACK, SAVEPOINT, TRY/CATCH trên KyThuatVien; giải thích khóa và phiên bản (A07).</w:t>
             </w:r>
           </w:p>
           <w:p>
@@ -2043,7 +2103,7 @@
               <w:rPr>
                 <w:rFonts w:ascii="Times New Roman" w:hAnsi="Times New Roman" w:cs="Times New Roman"/>
               </w:rPr>
-              <w:t>- Kiểm tra FK/CHECK, recovery model và ví khớp sổ cái trước sao lưu (A07).</w:t>
+              <w:t>- GRANT/REVOKE/GRANT/DENY SELECT trên vw_ViKyThuatVien cho role KT; EXECUTE AS, REVERT và khôi phục quyền (A08).</w:t>
             </w:r>
           </w:p>
           <w:p>
@@ -2058,7 +2118,7 @@
               <w:rPr>
                 <w:rFonts w:ascii="Times New Roman" w:hAnsi="Times New Roman" w:cs="Times New Roman"/>
               </w:rPr>
-              <w:t>- Demo backup FULL, DIFF, LOG; giải thích COPY_ONLY và VERIFYONLY (A08).</w:t>
+              <w:t>- Đối chiếu module nâng cấp; tự mô phỏng ALTER có điều kiện cho dữ liệu thanh toán, đối soát và ví kỹ thuật viên, chạy lại không trùng cột (A09).</w:t>
             </w:r>
           </w:p>
           <w:p>
@@ -2073,7 +2133,7 @@
               <w:rPr>
                 <w:rFonts w:ascii="Times New Roman" w:hAnsi="Times New Roman" w:cs="Times New Roman"/>
               </w:rPr>
-              <w:t>- Phục hồi sang tên mới bằng MOVE, NORECOVERY/RECOVERY; đọc dữ liệu và CHECKDB (A08).</w:t>
+              <w:t>- Tự sao lưu COPY_ONLY theo MSSV, VERIFYONLY; thực hiện FULL/DIFF/LOG, RESTORE MOVE và kiểm tra dữ liệu trên bản riêng (A10; file 05).</w:t>
             </w:r>
           </w:p>
         </w:tc>

</xml_diff>